<commit_message>
feat(main): use make command to lab11
</commit_message>
<xml_diff>
--- a/labs/lab11/report/report.docx
+++ b/labs/lab11/report/report.docx
@@ -104,12 +104,21 @@
         </w:p>
       </w:sdtContent>
     </w:sdt>
-    <w:bookmarkStart w:id="9" w:name="цель-работы"/>
+    <w:bookmarkStart w:id="20" w:name="цель-работы"/>
     <w:p>
       <w:pPr>
         <w:pStyle w:val="Heading1"/>
       </w:pPr>
       <w:r>
+        <w:rPr>
+          <w:rStyle w:val="SectionNumber"/>
+        </w:rPr>
+        <w:t xml:space="preserve">1</w:t>
+      </w:r>
+      <w:r>
+        <w:tab/>
+      </w:r>
+      <w:r>
         <w:t xml:space="preserve">Цель работы</w:t>
       </w:r>
     </w:p>
@@ -133,12 +142,21 @@
         <w:t xml:space="preserve">.</w:t>
       </w:r>
     </w:p>
-    <w:bookmarkEnd w:id="9"/>
-    <w:bookmarkStart w:id="10" w:name="задание"/>
+    <w:bookmarkEnd w:id="20"/>
+    <w:bookmarkStart w:id="21" w:name="задание"/>
     <w:p>
       <w:pPr>
         <w:pStyle w:val="Heading1"/>
       </w:pPr>
+      <w:r>
+        <w:rPr>
+          <w:rStyle w:val="SectionNumber"/>
+        </w:rPr>
+        <w:t xml:space="preserve">2</w:t>
+      </w:r>
+      <w:r>
+        <w:tab/>
+      </w:r>
       <w:r>
         <w:t xml:space="preserve">Задание</w:t>
       </w:r>
@@ -239,12 +257,21 @@
         <w:t xml:space="preserve">Зафиксировать результаты в виде снимков экрана, листинга программы и ответов на контрольные вопросы.</w:t>
       </w:r>
     </w:p>
-    <w:bookmarkEnd w:id="10"/>
-    <w:bookmarkStart w:id="11" w:name="теоретическое-введение"/>
+    <w:bookmarkEnd w:id="21"/>
+    <w:bookmarkStart w:id="22" w:name="теоретическое-введение"/>
     <w:p>
       <w:pPr>
         <w:pStyle w:val="Heading1"/>
       </w:pPr>
+      <w:r>
+        <w:rPr>
+          <w:rStyle w:val="SectionNumber"/>
+        </w:rPr>
+        <w:t xml:space="preserve">3</w:t>
+      </w:r>
+      <w:r>
+        <w:tab/>
+      </w:r>
       <w:r>
         <w:t xml:space="preserve">Теоретическое введение</w:t>
       </w:r>
@@ -864,22 +891,40 @@
         </w:tc>
       </w:tr>
     </w:tbl>
-    <w:bookmarkEnd w:id="11"/>
-    <w:bookmarkStart w:id="86" w:name="выполнение-лабораторной-работы"/>
+    <w:bookmarkEnd w:id="22"/>
+    <w:bookmarkStart w:id="97" w:name="выполнение-лабораторной-работы"/>
     <w:p>
       <w:pPr>
         <w:pStyle w:val="Heading1"/>
       </w:pPr>
       <w:r>
+        <w:rPr>
+          <w:rStyle w:val="SectionNumber"/>
+        </w:rPr>
+        <w:t xml:space="preserve">4</w:t>
+      </w:r>
+      <w:r>
+        <w:tab/>
+      </w:r>
+      <w:r>
         <w:t xml:space="preserve">Выполнение лабораторной работы</w:t>
       </w:r>
     </w:p>
-    <w:bookmarkStart w:id="16" w:name="запуск-emacs"/>
+    <w:bookmarkStart w:id="27" w:name="запуск-emacs"/>
     <w:p>
       <w:pPr>
         <w:pStyle w:val="Heading2"/>
       </w:pPr>
       <w:r>
+        <w:rPr>
+          <w:rStyle w:val="SectionNumber"/>
+        </w:rPr>
+        <w:t xml:space="preserve">4.1</w:t>
+      </w:r>
+      <w:r>
+        <w:tab/>
+      </w:r>
+      <w:r>
         <w:t xml:space="preserve">Запуск Emacs</w:t>
       </w:r>
     </w:p>
@@ -906,7 +951,7 @@
         <w:t xml:space="preserve">и проверяю его стартовое окно.</w:t>
       </w:r>
     </w:p>
-    <w:bookmarkStart w:id="15" w:name="fig:001"/>
+    <w:bookmarkStart w:id="26" w:name="fig:001"/>
     <w:p>
       <w:pPr>
         <w:pStyle w:val="CaptionedFigure"/>
@@ -916,18 +961,18 @@
           <wp:inline>
             <wp:extent cx="3733800" cy="2347106"/>
             <wp:effectExtent b="0" l="0" r="0" t="0"/>
-            <wp:docPr descr="Стартовое окно редактора Emacs" title="" id="13" name="Picture"/>
+            <wp:docPr descr="Стартовое окно редактора Emacs" title="" id="24" name="Picture"/>
             <a:graphic>
               <a:graphicData uri="http://schemas.openxmlformats.org/drawingml/2006/picture">
                 <pic:pic>
                   <pic:nvPicPr>
-                    <pic:cNvPr descr="image/1.png" id="14" name="Picture"/>
+                    <pic:cNvPr descr="image/1.png" id="25" name="Picture"/>
                     <pic:cNvPicPr>
                       <a:picLocks noChangeArrowheads="1" noChangeAspect="1"/>
                     </pic:cNvPicPr>
                   </pic:nvPicPr>
                   <pic:blipFill>
-                    <a:blip r:embed="rId12"/>
+                    <a:blip r:embed="rId23"/>
                     <a:stretch>
                       <a:fillRect/>
                     </a:stretch>
@@ -962,14 +1007,23 @@
         <w:t xml:space="preserve">Стартовое окно редактора Emacs</w:t>
       </w:r>
     </w:p>
-    <w:bookmarkEnd w:id="15"/>
-    <w:bookmarkEnd w:id="16"/>
-    <w:bookmarkStart w:id="21" w:name="создание-файла-lab11.sh"/>
+    <w:bookmarkEnd w:id="26"/>
+    <w:bookmarkEnd w:id="27"/>
+    <w:bookmarkStart w:id="32" w:name="создание-файла-lab11.sh"/>
     <w:p>
       <w:pPr>
         <w:pStyle w:val="Heading2"/>
       </w:pPr>
       <w:r>
+        <w:rPr>
+          <w:rStyle w:val="SectionNumber"/>
+        </w:rPr>
+        <w:t xml:space="preserve">4.2</w:t>
+      </w:r>
+      <w:r>
+        <w:tab/>
+      </w:r>
+      <w:r>
         <w:t xml:space="preserve">Создание файла</w:t>
       </w:r>
       <w:r>
@@ -1041,7 +1095,7 @@
         <w:t xml:space="preserve">.</w:t>
       </w:r>
     </w:p>
-    <w:bookmarkStart w:id="20" w:name="fig:002"/>
+    <w:bookmarkStart w:id="31" w:name="fig:002"/>
     <w:p>
       <w:pPr>
         <w:pStyle w:val="CaptionedFigure"/>
@@ -1051,18 +1105,18 @@
           <wp:inline>
             <wp:extent cx="3733800" cy="2309158"/>
             <wp:effectExtent b="0" l="0" r="0" t="0"/>
-            <wp:docPr descr="Создание нового файла lab11.sh" title="" id="18" name="Picture"/>
+            <wp:docPr descr="Создание нового файла lab11.sh" title="" id="29" name="Picture"/>
             <a:graphic>
               <a:graphicData uri="http://schemas.openxmlformats.org/drawingml/2006/picture">
                 <pic:pic>
                   <pic:nvPicPr>
-                    <pic:cNvPr descr="image/2.png" id="19" name="Picture"/>
+                    <pic:cNvPr descr="image/2.png" id="30" name="Picture"/>
                     <pic:cNvPicPr>
                       <a:picLocks noChangeArrowheads="1" noChangeAspect="1"/>
                     </pic:cNvPicPr>
                   </pic:nvPicPr>
                   <pic:blipFill>
-                    <a:blip r:embed="rId17"/>
+                    <a:blip r:embed="rId28"/>
                     <a:stretch>
                       <a:fillRect/>
                     </a:stretch>
@@ -1097,14 +1151,23 @@
         <w:t xml:space="preserve">Создание нового файла lab11.sh</w:t>
       </w:r>
     </w:p>
-    <w:bookmarkEnd w:id="20"/>
-    <w:bookmarkEnd w:id="21"/>
-    <w:bookmarkStart w:id="30" w:name="ввод-и-сохранение-исходного-текста"/>
+    <w:bookmarkEnd w:id="31"/>
+    <w:bookmarkEnd w:id="32"/>
+    <w:bookmarkStart w:id="41" w:name="ввод-и-сохранение-исходного-текста"/>
     <w:p>
       <w:pPr>
         <w:pStyle w:val="Heading2"/>
       </w:pPr>
       <w:r>
+        <w:rPr>
+          <w:rStyle w:val="SectionNumber"/>
+        </w:rPr>
+        <w:t xml:space="preserve">4.3</w:t>
+      </w:r>
+      <w:r>
+        <w:tab/>
+      </w:r>
+      <w:r>
         <w:t xml:space="preserve">Ввод и сохранение исходного текста</w:t>
       </w:r>
     </w:p>
@@ -1250,7 +1313,7 @@
         <w:t xml:space="preserve">hello</w:t>
       </w:r>
     </w:p>
-    <w:bookmarkStart w:id="25" w:name="fig:003"/>
+    <w:bookmarkStart w:id="36" w:name="fig:003"/>
     <w:p>
       <w:pPr>
         <w:pStyle w:val="CaptionedFigure"/>
@@ -1260,18 +1323,18 @@
           <wp:inline>
             <wp:extent cx="3733800" cy="2262608"/>
             <wp:effectExtent b="0" l="0" r="0" t="0"/>
-            <wp:docPr descr="Ввод исходного текста программы в файл lab11.sh" title="" id="23" name="Picture"/>
+            <wp:docPr descr="Ввод исходного текста программы в файл lab11.sh" title="" id="34" name="Picture"/>
             <a:graphic>
               <a:graphicData uri="http://schemas.openxmlformats.org/drawingml/2006/picture">
                 <pic:pic>
                   <pic:nvPicPr>
-                    <pic:cNvPr descr="image/3.png" id="24" name="Picture"/>
+                    <pic:cNvPr descr="image/3.png" id="35" name="Picture"/>
                     <pic:cNvPicPr>
                       <a:picLocks noChangeArrowheads="1" noChangeAspect="1"/>
                     </pic:cNvPicPr>
                   </pic:nvPicPr>
                   <pic:blipFill>
-                    <a:blip r:embed="rId22"/>
+                    <a:blip r:embed="rId33"/>
                     <a:stretch>
                       <a:fillRect/>
                     </a:stretch>
@@ -1306,7 +1369,7 @@
         <w:t xml:space="preserve">Ввод исходного текста программы в файл lab11.sh</w:t>
       </w:r>
     </w:p>
-    <w:bookmarkEnd w:id="25"/>
+    <w:bookmarkEnd w:id="36"/>
     <w:p>
       <w:pPr>
         <w:pStyle w:val="BodyText"/>
@@ -1327,7 +1390,7 @@
         <w:t xml:space="preserve">.</w:t>
       </w:r>
     </w:p>
-    <w:bookmarkStart w:id="29" w:name="fig:004"/>
+    <w:bookmarkStart w:id="40" w:name="fig:004"/>
     <w:p>
       <w:pPr>
         <w:pStyle w:val="CaptionedFigure"/>
@@ -1337,18 +1400,18 @@
           <wp:inline>
             <wp:extent cx="3733800" cy="2467879"/>
             <wp:effectExtent b="0" l="0" r="0" t="0"/>
-            <wp:docPr descr="Сохранение файла lab11.sh" title="" id="27" name="Picture"/>
+            <wp:docPr descr="Сохранение файла lab11.sh" title="" id="38" name="Picture"/>
             <a:graphic>
               <a:graphicData uri="http://schemas.openxmlformats.org/drawingml/2006/picture">
                 <pic:pic>
                   <pic:nvPicPr>
-                    <pic:cNvPr descr="image/4.png" id="28" name="Picture"/>
+                    <pic:cNvPr descr="image/4.png" id="39" name="Picture"/>
                     <pic:cNvPicPr>
                       <a:picLocks noChangeArrowheads="1" noChangeAspect="1"/>
                     </pic:cNvPicPr>
                   </pic:nvPicPr>
                   <pic:blipFill>
-                    <a:blip r:embed="rId26"/>
+                    <a:blip r:embed="rId37"/>
                     <a:stretch>
                       <a:fillRect/>
                     </a:stretch>
@@ -1383,14 +1446,23 @@
         <w:t xml:space="preserve">Сохранение файла lab11.sh</w:t>
       </w:r>
     </w:p>
-    <w:bookmarkEnd w:id="29"/>
-    <w:bookmarkEnd w:id="30"/>
-    <w:bookmarkStart w:id="39" w:name="редактирование-текста"/>
+    <w:bookmarkEnd w:id="40"/>
+    <w:bookmarkEnd w:id="41"/>
+    <w:bookmarkStart w:id="50" w:name="редактирование-текста"/>
     <w:p>
       <w:pPr>
         <w:pStyle w:val="Heading2"/>
       </w:pPr>
       <w:r>
+        <w:rPr>
+          <w:rStyle w:val="SectionNumber"/>
+        </w:rPr>
+        <w:t xml:space="preserve">4.4</w:t>
+      </w:r>
+      <w:r>
+        <w:tab/>
+      </w:r>
+      <w:r>
         <w:t xml:space="preserve">Редактирование текста</w:t>
       </w:r>
     </w:p>
@@ -1489,7 +1561,7 @@
         <w:t xml:space="preserve">, что подтверждает успешное применение операций копирования и вставки.</w:t>
       </w:r>
     </w:p>
-    <w:bookmarkStart w:id="34" w:name="fig:005"/>
+    <w:bookmarkStart w:id="45" w:name="fig:005"/>
     <w:p>
       <w:pPr>
         <w:pStyle w:val="CaptionedFigure"/>
@@ -1499,18 +1571,18 @@
           <wp:inline>
             <wp:extent cx="3733800" cy="2425100"/>
             <wp:effectExtent b="0" l="0" r="0" t="0"/>
-            <wp:docPr descr="Результат операций вырезания и вставки текста" title="" id="32" name="Picture"/>
+            <wp:docPr descr="Результат операций вырезания и вставки текста" title="" id="43" name="Picture"/>
             <a:graphic>
               <a:graphicData uri="http://schemas.openxmlformats.org/drawingml/2006/picture">
                 <pic:pic>
                   <pic:nvPicPr>
-                    <pic:cNvPr descr="image/5.png" id="33" name="Picture"/>
+                    <pic:cNvPr descr="image/5.png" id="44" name="Picture"/>
                     <pic:cNvPicPr>
                       <a:picLocks noChangeArrowheads="1" noChangeAspect="1"/>
                     </pic:cNvPicPr>
                   </pic:nvPicPr>
                   <pic:blipFill>
-                    <a:blip r:embed="rId31"/>
+                    <a:blip r:embed="rId42"/>
                     <a:stretch>
                       <a:fillRect/>
                     </a:stretch>
@@ -1545,7 +1617,7 @@
         <w:t xml:space="preserve">Результат операций вырезания и вставки текста</w:t>
       </w:r>
     </w:p>
-    <w:bookmarkEnd w:id="34"/>
+    <w:bookmarkEnd w:id="45"/>
     <w:p>
       <w:pPr>
         <w:pStyle w:val="BodyText"/>
@@ -1554,7 +1626,7 @@
         <w:t xml:space="preserve">На следующем снимке видно позиционирование курсора внутри редактируемого текста после выполнения команд выделения и перемещения по строкам.</w:t>
       </w:r>
     </w:p>
-    <w:bookmarkStart w:id="38" w:name="fig:006"/>
+    <w:bookmarkStart w:id="49" w:name="fig:006"/>
     <w:p>
       <w:pPr>
         <w:pStyle w:val="CaptionedFigure"/>
@@ -1564,18 +1636,18 @@
           <wp:inline>
             <wp:extent cx="3200400" cy="1673279"/>
             <wp:effectExtent b="0" l="0" r="0" t="0"/>
-            <wp:docPr descr="Работа с областью текста и позиционирование курсора" title="" id="36" name="Picture"/>
+            <wp:docPr descr="Работа с областью текста и позиционирование курсора" title="" id="47" name="Picture"/>
             <a:graphic>
               <a:graphicData uri="http://schemas.openxmlformats.org/drawingml/2006/picture">
                 <pic:pic>
                   <pic:nvPicPr>
-                    <pic:cNvPr descr="image/7.png" id="37" name="Picture"/>
+                    <pic:cNvPr descr="image/7.png" id="48" name="Picture"/>
                     <pic:cNvPicPr>
                       <a:picLocks noChangeArrowheads="1" noChangeAspect="1"/>
                     </pic:cNvPicPr>
                   </pic:nvPicPr>
                   <pic:blipFill>
-                    <a:blip r:embed="rId35"/>
+                    <a:blip r:embed="rId46"/>
                     <a:stretch>
                       <a:fillRect/>
                     </a:stretch>
@@ -1610,14 +1682,23 @@
         <w:t xml:space="preserve">Работа с областью текста и позиционирование курсора</w:t>
       </w:r>
     </w:p>
-    <w:bookmarkEnd w:id="38"/>
-    <w:bookmarkEnd w:id="39"/>
-    <w:bookmarkStart w:id="48" w:name="перемещение-по-строке-и-буферу"/>
+    <w:bookmarkEnd w:id="49"/>
+    <w:bookmarkEnd w:id="50"/>
+    <w:bookmarkStart w:id="59" w:name="перемещение-по-строке-и-буферу"/>
     <w:p>
       <w:pPr>
         <w:pStyle w:val="Heading2"/>
       </w:pPr>
       <w:r>
+        <w:rPr>
+          <w:rStyle w:val="SectionNumber"/>
+        </w:rPr>
+        <w:t xml:space="preserve">4.5</w:t>
+      </w:r>
+      <w:r>
+        <w:tab/>
+      </w:r>
+      <w:r>
         <w:t xml:space="preserve">Перемещение по строке и буферу</w:t>
       </w:r>
     </w:p>
@@ -1680,7 +1761,7 @@
         <w:t xml:space="preserve">. На снимках экрана последовательно зафиксированы переходы к началу файла и к концу буфера.</w:t>
       </w:r>
     </w:p>
-    <w:bookmarkStart w:id="43" w:name="fig:007"/>
+    <w:bookmarkStart w:id="54" w:name="fig:007"/>
     <w:p>
       <w:pPr>
         <w:pStyle w:val="CaptionedFigure"/>
@@ -1690,18 +1771,18 @@
           <wp:inline>
             <wp:extent cx="3200400" cy="1842116"/>
             <wp:effectExtent b="0" l="0" r="0" t="0"/>
-            <wp:docPr descr="Переход к началу файла и началу строки" title="" id="41" name="Picture"/>
+            <wp:docPr descr="Переход к началу файла и началу строки" title="" id="52" name="Picture"/>
             <a:graphic>
               <a:graphicData uri="http://schemas.openxmlformats.org/drawingml/2006/picture">
                 <pic:pic>
                   <pic:nvPicPr>
-                    <pic:cNvPr descr="image/6.png" id="42" name="Picture"/>
+                    <pic:cNvPr descr="image/6.png" id="53" name="Picture"/>
                     <pic:cNvPicPr>
                       <a:picLocks noChangeArrowheads="1" noChangeAspect="1"/>
                     </pic:cNvPicPr>
                   </pic:nvPicPr>
                   <pic:blipFill>
-                    <a:blip r:embed="rId40"/>
+                    <a:blip r:embed="rId51"/>
                     <a:stretch>
                       <a:fillRect/>
                     </a:stretch>
@@ -1736,8 +1817,8 @@
         <w:t xml:space="preserve">Переход к началу файла и началу строки</w:t>
       </w:r>
     </w:p>
-    <w:bookmarkEnd w:id="43"/>
-    <w:bookmarkStart w:id="47" w:name="fig:008"/>
+    <w:bookmarkEnd w:id="54"/>
+    <w:bookmarkStart w:id="58" w:name="fig:008"/>
     <w:p>
       <w:pPr>
         <w:pStyle w:val="CaptionedFigure"/>
@@ -1747,18 +1828,18 @@
           <wp:inline>
             <wp:extent cx="3200400" cy="1593875"/>
             <wp:effectExtent b="0" l="0" r="0" t="0"/>
-            <wp:docPr descr="Переход к концу буфера" title="" id="45" name="Picture"/>
+            <wp:docPr descr="Переход к концу буфера" title="" id="56" name="Picture"/>
             <a:graphic>
               <a:graphicData uri="http://schemas.openxmlformats.org/drawingml/2006/picture">
                 <pic:pic>
                   <pic:nvPicPr>
-                    <pic:cNvPr descr="image/8.png" id="46" name="Picture"/>
+                    <pic:cNvPr descr="image/8.png" id="57" name="Picture"/>
                     <pic:cNvPicPr>
                       <a:picLocks noChangeArrowheads="1" noChangeAspect="1"/>
                     </pic:cNvPicPr>
                   </pic:nvPicPr>
                   <pic:blipFill>
-                    <a:blip r:embed="rId44"/>
+                    <a:blip r:embed="rId55"/>
                     <a:stretch>
                       <a:fillRect/>
                     </a:stretch>
@@ -1793,14 +1874,23 @@
         <w:t xml:space="preserve">Переход к концу буфера</w:t>
       </w:r>
     </w:p>
-    <w:bookmarkEnd w:id="47"/>
-    <w:bookmarkEnd w:id="48"/>
-    <w:bookmarkStart w:id="57" w:name="работа-с-буферами"/>
+    <w:bookmarkEnd w:id="58"/>
+    <w:bookmarkEnd w:id="59"/>
+    <w:bookmarkStart w:id="68" w:name="работа-с-буферами"/>
     <w:p>
       <w:pPr>
         <w:pStyle w:val="Heading2"/>
       </w:pPr>
       <w:r>
+        <w:rPr>
+          <w:rStyle w:val="SectionNumber"/>
+        </w:rPr>
+        <w:t xml:space="preserve">4.6</w:t>
+      </w:r>
+      <w:r>
+        <w:tab/>
+      </w:r>
+      <w:r>
         <w:t xml:space="preserve">Работа с буферами</w:t>
       </w:r>
     </w:p>
@@ -1878,7 +1968,7 @@
         <w:t xml:space="preserve">.</w:t>
       </w:r>
     </w:p>
-    <w:bookmarkStart w:id="52" w:name="fig:009"/>
+    <w:bookmarkStart w:id="63" w:name="fig:009"/>
     <w:p>
       <w:pPr>
         <w:pStyle w:val="CaptionedFigure"/>
@@ -1888,18 +1978,18 @@
           <wp:inline>
             <wp:extent cx="3733800" cy="2227396"/>
             <wp:effectExtent b="0" l="0" r="0" t="0"/>
-            <wp:docPr descr="Список буферов Emacs" title="" id="50" name="Picture"/>
+            <wp:docPr descr="Список буферов Emacs" title="" id="61" name="Picture"/>
             <a:graphic>
               <a:graphicData uri="http://schemas.openxmlformats.org/drawingml/2006/picture">
                 <pic:pic>
                   <pic:nvPicPr>
-                    <pic:cNvPr descr="image/9.png" id="51" name="Picture"/>
+                    <pic:cNvPr descr="image/9.png" id="62" name="Picture"/>
                     <pic:cNvPicPr>
                       <a:picLocks noChangeArrowheads="1" noChangeAspect="1"/>
                     </pic:cNvPicPr>
                   </pic:nvPicPr>
                   <pic:blipFill>
-                    <a:blip r:embed="rId49"/>
+                    <a:blip r:embed="rId60"/>
                     <a:stretch>
                       <a:fillRect/>
                     </a:stretch>
@@ -1934,7 +2024,7 @@
         <w:t xml:space="preserve">Список буферов Emacs</w:t>
       </w:r>
     </w:p>
-    <w:bookmarkEnd w:id="52"/>
+    <w:bookmarkEnd w:id="63"/>
     <w:p>
       <w:pPr>
         <w:pStyle w:val="BodyText"/>
@@ -1943,7 +2033,7 @@
         <w:t xml:space="preserve">Затем перехожу в другой буфер и возвращаюсь к рабочему сеансу редактора.</w:t>
       </w:r>
     </w:p>
-    <w:bookmarkStart w:id="56" w:name="fig:010"/>
+    <w:bookmarkStart w:id="67" w:name="fig:010"/>
     <w:p>
       <w:pPr>
         <w:pStyle w:val="CaptionedFigure"/>
@@ -1953,18 +2043,18 @@
           <wp:inline>
             <wp:extent cx="3733800" cy="2210802"/>
             <wp:effectExtent b="0" l="0" r="0" t="0"/>
-            <wp:docPr descr="Переключение между буферами" title="" id="54" name="Picture"/>
+            <wp:docPr descr="Переключение между буферами" title="" id="65" name="Picture"/>
             <a:graphic>
               <a:graphicData uri="http://schemas.openxmlformats.org/drawingml/2006/picture">
                 <pic:pic>
                   <pic:nvPicPr>
-                    <pic:cNvPr descr="image/10.png" id="55" name="Picture"/>
+                    <pic:cNvPr descr="image/10.png" id="66" name="Picture"/>
                     <pic:cNvPicPr>
                       <a:picLocks noChangeArrowheads="1" noChangeAspect="1"/>
                     </pic:cNvPicPr>
                   </pic:nvPicPr>
                   <pic:blipFill>
-                    <a:blip r:embed="rId53"/>
+                    <a:blip r:embed="rId64"/>
                     <a:stretch>
                       <a:fillRect/>
                     </a:stretch>
@@ -1999,14 +2089,23 @@
         <w:t xml:space="preserve">Переключение между буферами</w:t>
       </w:r>
     </w:p>
-    <w:bookmarkEnd w:id="56"/>
-    <w:bookmarkEnd w:id="57"/>
-    <w:bookmarkStart w:id="66" w:name="работа-с-окнами"/>
+    <w:bookmarkEnd w:id="67"/>
+    <w:bookmarkEnd w:id="68"/>
+    <w:bookmarkStart w:id="77" w:name="работа-с-окнами"/>
     <w:p>
       <w:pPr>
         <w:pStyle w:val="Heading2"/>
       </w:pPr>
       <w:r>
+        <w:rPr>
+          <w:rStyle w:val="SectionNumber"/>
+        </w:rPr>
+        <w:t xml:space="preserve">4.7</w:t>
+      </w:r>
+      <w:r>
+        <w:tab/>
+      </w:r>
+      <w:r>
         <w:t xml:space="preserve">Работа с окнами</w:t>
       </w:r>
     </w:p>
@@ -2060,7 +2159,7 @@
         <w:t xml:space="preserve">делю рабочее пространство на четыре окна.</w:t>
       </w:r>
     </w:p>
-    <w:bookmarkStart w:id="61" w:name="fig:011"/>
+    <w:bookmarkStart w:id="72" w:name="fig:011"/>
     <w:p>
       <w:pPr>
         <w:pStyle w:val="CaptionedFigure"/>
@@ -2070,18 +2169,18 @@
           <wp:inline>
             <wp:extent cx="4267200" cy="2400127"/>
             <wp:effectExtent b="0" l="0" r="0" t="0"/>
-            <wp:docPr descr="Разделение рабочего пространства Emacs на четыре окна" title="" id="59" name="Picture"/>
+            <wp:docPr descr="Разделение рабочего пространства Emacs на четыре окна" title="" id="70" name="Picture"/>
             <a:graphic>
               <a:graphicData uri="http://schemas.openxmlformats.org/drawingml/2006/picture">
                 <pic:pic>
                   <pic:nvPicPr>
-                    <pic:cNvPr descr="image/11.png" id="60" name="Picture"/>
+                    <pic:cNvPr descr="image/11.png" id="71" name="Picture"/>
                     <pic:cNvPicPr>
                       <a:picLocks noChangeArrowheads="1" noChangeAspect="1"/>
                     </pic:cNvPicPr>
                   </pic:nvPicPr>
                   <pic:blipFill>
-                    <a:blip r:embed="rId58"/>
+                    <a:blip r:embed="rId69"/>
                     <a:stretch>
                       <a:fillRect/>
                     </a:stretch>
@@ -2116,7 +2215,7 @@
         <w:t xml:space="preserve">Разделение рабочего пространства Emacs на четыре окна</w:t>
       </w:r>
     </w:p>
-    <w:bookmarkEnd w:id="61"/>
+    <w:bookmarkEnd w:id="72"/>
     <w:p>
       <w:pPr>
         <w:pStyle w:val="BodyText"/>
@@ -2125,7 +2224,7 @@
         <w:t xml:space="preserve">После этого в отдельных окнах открываю разные буферы и ввожу дополнительный текст для проверки переключения между окнами и буферами.</w:t>
       </w:r>
     </w:p>
-    <w:bookmarkStart w:id="65" w:name="fig:012"/>
+    <w:bookmarkStart w:id="76" w:name="fig:012"/>
     <w:p>
       <w:pPr>
         <w:pStyle w:val="CaptionedFigure"/>
@@ -2135,18 +2234,18 @@
           <wp:inline>
             <wp:extent cx="4267200" cy="2045321"/>
             <wp:effectExtent b="0" l="0" r="0" t="0"/>
-            <wp:docPr descr="Работа с несколькими окнами и буферами" title="" id="63" name="Picture"/>
+            <wp:docPr descr="Работа с несколькими окнами и буферами" title="" id="74" name="Picture"/>
             <a:graphic>
               <a:graphicData uri="http://schemas.openxmlformats.org/drawingml/2006/picture">
                 <pic:pic>
                   <pic:nvPicPr>
-                    <pic:cNvPr descr="image/12.png" id="64" name="Picture"/>
+                    <pic:cNvPr descr="image/12.png" id="75" name="Picture"/>
                     <pic:cNvPicPr>
                       <a:picLocks noChangeArrowheads="1" noChangeAspect="1"/>
                     </pic:cNvPicPr>
                   </pic:nvPicPr>
                   <pic:blipFill>
-                    <a:blip r:embed="rId62"/>
+                    <a:blip r:embed="rId73"/>
                     <a:stretch>
                       <a:fillRect/>
                     </a:stretch>
@@ -2181,14 +2280,23 @@
         <w:t xml:space="preserve">Работа с несколькими окнами и буферами</w:t>
       </w:r>
     </w:p>
-    <w:bookmarkEnd w:id="65"/>
-    <w:bookmarkEnd w:id="66"/>
-    <w:bookmarkStart w:id="71" w:name="поиск-текста"/>
+    <w:bookmarkEnd w:id="76"/>
+    <w:bookmarkEnd w:id="77"/>
+    <w:bookmarkStart w:id="82" w:name="поиск-текста"/>
     <w:p>
       <w:pPr>
         <w:pStyle w:val="Heading2"/>
       </w:pPr>
       <w:r>
+        <w:rPr>
+          <w:rStyle w:val="SectionNumber"/>
+        </w:rPr>
+        <w:t xml:space="preserve">4.8</w:t>
+      </w:r>
+      <w:r>
+        <w:tab/>
+      </w:r>
+      <w:r>
         <w:t xml:space="preserve">Поиск текста</w:t>
       </w:r>
     </w:p>
@@ -2212,7 +2320,7 @@
         <w:t xml:space="preserve">. Совпадения подсвечиваются прямо в текущем буфере.</w:t>
       </w:r>
     </w:p>
-    <w:bookmarkStart w:id="70" w:name="fig:013"/>
+    <w:bookmarkStart w:id="81" w:name="fig:013"/>
     <w:p>
       <w:pPr>
         <w:pStyle w:val="CaptionedFigure"/>
@@ -2222,18 +2330,18 @@
           <wp:inline>
             <wp:extent cx="3733800" cy="1681785"/>
             <wp:effectExtent b="0" l="0" r="0" t="0"/>
-            <wp:docPr descr="Инкрементный поиск текста в Emacs" title="" id="68" name="Picture"/>
+            <wp:docPr descr="Инкрементный поиск текста в Emacs" title="" id="79" name="Picture"/>
             <a:graphic>
               <a:graphicData uri="http://schemas.openxmlformats.org/drawingml/2006/picture">
                 <pic:pic>
                   <pic:nvPicPr>
-                    <pic:cNvPr descr="image/13.png" id="69" name="Picture"/>
+                    <pic:cNvPr descr="image/13.png" id="80" name="Picture"/>
                     <pic:cNvPicPr>
                       <a:picLocks noChangeArrowheads="1" noChangeAspect="1"/>
                     </pic:cNvPicPr>
                   </pic:nvPicPr>
                   <pic:blipFill>
-                    <a:blip r:embed="rId67"/>
+                    <a:blip r:embed="rId78"/>
                     <a:stretch>
                       <a:fillRect/>
                     </a:stretch>
@@ -2268,14 +2376,23 @@
         <w:t xml:space="preserve">Инкрементный поиск текста в Emacs</w:t>
       </w:r>
     </w:p>
-    <w:bookmarkEnd w:id="70"/>
-    <w:bookmarkEnd w:id="71"/>
-    <w:bookmarkStart w:id="80" w:name="поиск-и-замена"/>
+    <w:bookmarkEnd w:id="81"/>
+    <w:bookmarkEnd w:id="82"/>
+    <w:bookmarkStart w:id="91" w:name="поиск-и-замена"/>
     <w:p>
       <w:pPr>
         <w:pStyle w:val="Heading2"/>
       </w:pPr>
       <w:r>
+        <w:rPr>
+          <w:rStyle w:val="SectionNumber"/>
+        </w:rPr>
+        <w:t xml:space="preserve">4.9</w:t>
+      </w:r>
+      <w:r>
+        <w:tab/>
+      </w:r>
+      <w:r>
         <w:t xml:space="preserve">Поиск и замена</w:t>
       </w:r>
     </w:p>
@@ -2326,7 +2443,7 @@
         <w:t xml:space="preserve">.</w:t>
       </w:r>
     </w:p>
-    <w:bookmarkStart w:id="75" w:name="fig:014"/>
+    <w:bookmarkStart w:id="86" w:name="fig:014"/>
     <w:p>
       <w:pPr>
         <w:pStyle w:val="CaptionedFigure"/>
@@ -2336,18 +2453,18 @@
           <wp:inline>
             <wp:extent cx="3733800" cy="1746645"/>
             <wp:effectExtent b="0" l="0" r="0" t="0"/>
-            <wp:docPr descr="Запуск режима поиска и замены" title="" id="73" name="Picture"/>
+            <wp:docPr descr="Запуск режима поиска и замены" title="" id="84" name="Picture"/>
             <a:graphic>
               <a:graphicData uri="http://schemas.openxmlformats.org/drawingml/2006/picture">
                 <pic:pic>
                   <pic:nvPicPr>
-                    <pic:cNvPr descr="image/14.png" id="74" name="Picture"/>
+                    <pic:cNvPr descr="image/14.png" id="85" name="Picture"/>
                     <pic:cNvPicPr>
                       <a:picLocks noChangeArrowheads="1" noChangeAspect="1"/>
                     </pic:cNvPicPr>
                   </pic:nvPicPr>
                   <pic:blipFill>
-                    <a:blip r:embed="rId72"/>
+                    <a:blip r:embed="rId83"/>
                     <a:stretch>
                       <a:fillRect/>
                     </a:stretch>
@@ -2382,7 +2499,7 @@
         <w:t xml:space="preserve">Запуск режима поиска и замены</w:t>
       </w:r>
     </w:p>
-    <w:bookmarkEnd w:id="75"/>
+    <w:bookmarkEnd w:id="86"/>
     <w:p>
       <w:pPr>
         <w:pStyle w:val="BodyText"/>
@@ -2391,7 +2508,7 @@
         <w:t xml:space="preserve">После подтверждения замены получаю обновлённый результат в тексте файла.</w:t>
       </w:r>
     </w:p>
-    <w:bookmarkStart w:id="79" w:name="fig:015"/>
+    <w:bookmarkStart w:id="90" w:name="fig:015"/>
     <w:p>
       <w:pPr>
         <w:pStyle w:val="CaptionedFigure"/>
@@ -2401,18 +2518,18 @@
           <wp:inline>
             <wp:extent cx="3733800" cy="1744803"/>
             <wp:effectExtent b="0" l="0" r="0" t="0"/>
-            <wp:docPr descr="Результат замены текста в файле" title="" id="77" name="Picture"/>
+            <wp:docPr descr="Результат замены текста в файле" title="" id="88" name="Picture"/>
             <a:graphic>
               <a:graphicData uri="http://schemas.openxmlformats.org/drawingml/2006/picture">
                 <pic:pic>
                   <pic:nvPicPr>
-                    <pic:cNvPr descr="image/15.png" id="78" name="Picture"/>
+                    <pic:cNvPr descr="image/15.png" id="89" name="Picture"/>
                     <pic:cNvPicPr>
                       <a:picLocks noChangeArrowheads="1" noChangeAspect="1"/>
                     </pic:cNvPicPr>
                   </pic:nvPicPr>
                   <pic:blipFill>
-                    <a:blip r:embed="rId76"/>
+                    <a:blip r:embed="rId87"/>
                     <a:stretch>
                       <a:fillRect/>
                     </a:stretch>
@@ -2447,14 +2564,23 @@
         <w:t xml:space="preserve">Результат замены текста в файле</w:t>
       </w:r>
     </w:p>
-    <w:bookmarkEnd w:id="79"/>
-    <w:bookmarkEnd w:id="80"/>
-    <w:bookmarkStart w:id="85" w:name="альтернативный-поиск-m-s-o"/>
+    <w:bookmarkEnd w:id="90"/>
+    <w:bookmarkEnd w:id="91"/>
+    <w:bookmarkStart w:id="96" w:name="альтернативный-поиск-m-s-o"/>
     <w:p>
       <w:pPr>
         <w:pStyle w:val="Heading2"/>
       </w:pPr>
       <w:r>
+        <w:rPr>
+          <w:rStyle w:val="SectionNumber"/>
+        </w:rPr>
+        <w:t xml:space="preserve">4.10</w:t>
+      </w:r>
+      <w:r>
+        <w:tab/>
+      </w:r>
+      <w:r>
         <w:t xml:space="preserve">Альтернативный поиск</w:t>
       </w:r>
       <w:r>
@@ -2499,7 +2625,7 @@
         <w:t xml:space="preserve">, эта команда формирует отдельный буфер со списком всех найденных совпадений.</w:t>
       </w:r>
     </w:p>
-    <w:bookmarkStart w:id="84" w:name="fig:016"/>
+    <w:bookmarkStart w:id="95" w:name="fig:016"/>
     <w:p>
       <w:pPr>
         <w:pStyle w:val="CaptionedFigure"/>
@@ -2509,18 +2635,18 @@
           <wp:inline>
             <wp:extent cx="4267200" cy="2361126"/>
             <wp:effectExtent b="0" l="0" r="0" t="0"/>
-            <wp:docPr descr="Результат альтернативного поиска в отдельном буфере" title="" id="82" name="Picture"/>
+            <wp:docPr descr="Результат альтернативного поиска в отдельном буфере" title="" id="93" name="Picture"/>
             <a:graphic>
               <a:graphicData uri="http://schemas.openxmlformats.org/drawingml/2006/picture">
                 <pic:pic>
                   <pic:nvPicPr>
-                    <pic:cNvPr descr="image/16.png" id="83" name="Picture"/>
+                    <pic:cNvPr descr="image/16.png" id="94" name="Picture"/>
                     <pic:cNvPicPr>
                       <a:picLocks noChangeArrowheads="1" noChangeAspect="1"/>
                     </pic:cNvPicPr>
                   </pic:nvPicPr>
                   <pic:blipFill>
-                    <a:blip r:embed="rId81"/>
+                    <a:blip r:embed="rId92"/>
                     <a:stretch>
                       <a:fillRect/>
                     </a:stretch>
@@ -2555,14 +2681,23 @@
         <w:t xml:space="preserve">Результат альтернативного поиска в отдельном буфере</w:t>
       </w:r>
     </w:p>
-    <w:bookmarkEnd w:id="84"/>
-    <w:bookmarkEnd w:id="85"/>
-    <w:bookmarkEnd w:id="86"/>
-    <w:bookmarkStart w:id="87" w:name="ответы-на-контрольные-вопросы"/>
+    <w:bookmarkEnd w:id="95"/>
+    <w:bookmarkEnd w:id="96"/>
+    <w:bookmarkEnd w:id="97"/>
+    <w:bookmarkStart w:id="98" w:name="ответы-на-контрольные-вопросы"/>
     <w:p>
       <w:pPr>
         <w:pStyle w:val="Heading1"/>
       </w:pPr>
+      <w:r>
+        <w:rPr>
+          <w:rStyle w:val="SectionNumber"/>
+        </w:rPr>
+        <w:t xml:space="preserve">5</w:t>
+      </w:r>
+      <w:r>
+        <w:tab/>
+      </w:r>
       <w:r>
         <w:t xml:space="preserve">Ответы на контрольные вопросы</w:t>
       </w:r>
@@ -2995,13 +3130,22 @@
         <w:t xml:space="preserve">собирает все найденные совпадения и выводит их в отдельном буфере, что удобно для обзора результатов поиска.</w:t>
       </w:r>
     </w:p>
-    <w:bookmarkEnd w:id="87"/>
-    <w:bookmarkStart w:id="88" w:name="выводы"/>
+    <w:bookmarkEnd w:id="98"/>
+    <w:bookmarkStart w:id="99" w:name="выводы"/>
     <w:p>
       <w:pPr>
         <w:pStyle w:val="Heading1"/>
       </w:pPr>
       <w:r>
+        <w:rPr>
+          <w:rStyle w:val="SectionNumber"/>
+        </w:rPr>
+        <w:t xml:space="preserve">6</w:t>
+      </w:r>
+      <w:r>
+        <w:tab/>
+      </w:r>
+      <w:r>
         <w:t xml:space="preserve">Выводы</w:t>
       </w:r>
     </w:p>
@@ -3040,8 +3184,8 @@
         <w:t xml:space="preserve">, выводящий все совпадения в отдельный буфер.</w:t>
       </w:r>
     </w:p>
-    <w:bookmarkEnd w:id="88"/>
-    <w:bookmarkStart w:id="90" w:name="список-литературы"/>
+    <w:bookmarkEnd w:id="99"/>
+    <w:bookmarkStart w:id="101" w:name="список-литературы"/>
     <w:p>
       <w:pPr>
         <w:pStyle w:val="Heading1"/>
@@ -3050,9 +3194,9 @@
         <w:t xml:space="preserve">Список литературы</w:t>
       </w:r>
     </w:p>
-    <w:bookmarkStart w:id="89" w:name="refs"/>
-    <w:bookmarkEnd w:id="89"/>
-    <w:bookmarkEnd w:id="90"/>
+    <w:bookmarkStart w:id="100" w:name="refs"/>
+    <w:bookmarkEnd w:id="100"/>
+    <w:bookmarkEnd w:id="101"/>
     <w:sectPr>
       <w:footnotePr>
         <w:numRestart w:val="eachSect"/>
@@ -3280,10 +3424,10 @@
   <w:docDefaults>
     <w:rPrDefault>
       <w:rPr>
-        <w:rFonts w:asciiTheme="minorHAnsi" w:cstheme="minorBidi" w:eastAsiaTheme="minorEastAsia" w:hAnsiTheme="minorHAnsi"/>
+        <w:rFonts w:asciiTheme="minorHAnsi" w:cstheme="minorBidi" w:eastAsiaTheme="minorHAnsi" w:hAnsiTheme="minorHAnsi"/>
         <w:sz w:val="24"/>
         <w:szCs w:val="24"/>
-        <w:lang w:bidi="ar-SA" w:eastAsia="zh-CN" w:val="ru-RU"/>
+        <w:lang w:bidi="ar-SA" w:eastAsia="en-US" w:val="ru-RU"/>
       </w:rPr>
     </w:rPrDefault>
     <w:pPrDefault>
@@ -3824,6 +3968,13 @@
       </w:tblCellMar>
     </w:tblPr>
     <w:tblStylePr w:type="firstRow">
+      <w:tblPr>
+        <w:jc w:val="left"/>
+        <w:tblInd w:type="dxa" w:w="0"/>
+      </w:tblPr>
+      <w:trPr>
+        <w:jc w:val="left"/>
+      </w:trPr>
       <w:tcPr>
         <w:tcBorders>
           <w:bottom w:val="single"/>

</xml_diff>